<commit_message>
Implement user details retrieval and document generation enhancements in DocxFiller component. Add new API route for fetching user details associated with requests, and integrate officials data into document generation. Update AdminSidebar to include Tickets section and adjust layout styles for improved UI consistency across components.
</commit_message>
<xml_diff>
--- a/public/clearance.docx
+++ b/public/clearance.docx
@@ -756,343 +756,291 @@
     </w:p>
     <w:p>
       <w:pPr>
-        <w:spacing w:after="0" w:line="240" w:lineRule="auto"/>
-        <w:jc w:val="center"/>
+        <w:ind w:left="384"/>
         <w:rPr>
           <w:rFonts w:ascii="Times New Roman" w:hAnsi="Times New Roman" w:cs="Times New Roman"/>
           <w:b/>
-          <w:sz w:val="24"/>
-          <w:szCs w:val="24"/>
+          <w:sz w:val="10"/>
+          <w:szCs w:val="10"/>
+        </w:rPr>
+      </w:pPr>
+    </w:p>
+    <w:p>
+      <w:pPr>
+        <w:ind w:left="384"/>
+        <w:rPr>
+          <w:rFonts w:ascii="Times New Roman" w:hAnsi="Times New Roman" w:cs="Times New Roman"/>
+          <w:b/>
+          <w:sz w:val="15"/>
+          <w:szCs w:val="15"/>
         </w:rPr>
       </w:pPr>
       <w:r>
         <w:rPr>
           <w:rFonts w:ascii="Times New Roman" w:hAnsi="Times New Roman" w:cs="Times New Roman"/>
           <w:b/>
-          <w:sz w:val="24"/>
-          <w:szCs w:val="24"/>
+          <w:sz w:val="15"/>
+          <w:szCs w:val="15"/>
         </w:rPr>
-        <w:t>HON. JERRY P. LEYESA</w:t>
+        <w:t>CHAIRMAN:</w:t>
       </w:r>
     </w:p>
     <w:p>
       <w:pPr>
-        <w:spacing w:after="0" w:line="240" w:lineRule="auto"/>
-        <w:jc w:val="center"/>
+        <w:ind w:left="384"/>
         <w:rPr>
           <w:rFonts w:ascii="Times New Roman" w:hAnsi="Times New Roman" w:cs="Times New Roman"/>
           <w:b/>
-        </w:rPr>
-      </w:pPr>
-      <w:r>
-        <w:t>Barangay Chairman</w:t>
-      </w:r>
-    </w:p>
-    <w:p>
-      <w:pPr>
-        <w:rPr>
-          <w:rFonts w:ascii="Times New Roman" w:hAnsi="Times New Roman" w:cs="Times New Roman"/>
-          <w:b/>
-        </w:rPr>
-      </w:pPr>
-    </w:p>
-    <w:p>
-      <w:pPr>
-        <w:jc w:val="center"/>
-        <w:rPr>
-          <w:rFonts w:ascii="Times New Roman" w:hAnsi="Times New Roman" w:cs="Times New Roman"/>
-          <w:i/>
-          <w:iCs/>
+          <w:sz w:val="15"/>
+          <w:szCs w:val="15"/>
         </w:rPr>
       </w:pPr>
       <w:r>
         <w:rPr>
           <w:rFonts w:ascii="Times New Roman" w:hAnsi="Times New Roman" w:cs="Times New Roman"/>
           <w:b/>
-          <w:i/>
-          <w:iCs/>
+          <w:sz w:val="15"/>
+          <w:szCs w:val="15"/>
         </w:rPr>
-        <w:t>BRGY. COUNCILORS:</w:t>
-      </w:r>
-      <w:r>
-        <w:rPr>
-          <w:rFonts w:ascii="Times New Roman" w:hAnsi="Times New Roman" w:cs="Times New Roman"/>
-          <w:b/>
-          <w:i/>
-          <w:iCs/>
-        </w:rPr>
-        <w:br/>
+        <w:t>+++INS chairman.name+++</w:t>
       </w:r>
     </w:p>
     <w:p>
       <w:pPr>
-        <w:spacing w:after="0"/>
-        <w:jc w:val="center"/>
+        <w:ind w:left="384"/>
         <w:rPr>
           <w:rFonts w:ascii="Times New Roman" w:hAnsi="Times New Roman" w:cs="Times New Roman"/>
-          <w:i/>
-          <w:iCs/>
+          <w:b/>
+          <w:sz w:val="15"/>
+          <w:szCs w:val="15"/>
         </w:rPr>
       </w:pPr>
       <w:r>
         <w:rPr>
           <w:rFonts w:ascii="Times New Roman" w:hAnsi="Times New Roman" w:cs="Times New Roman"/>
           <w:b/>
-          <w:bCs/>
+          <w:sz w:val="15"/>
+          <w:szCs w:val="15"/>
         </w:rPr>
-        <w:t>HON. ELENO D. MEA</w:t>
+        <w:t xml:space="preserve">+++INS </w:t>
+      </w:r>
+      <w:proofErr w:type="spellStart"/>
+      <w:proofErr w:type="gramStart"/>
+      <w:r>
+        <w:rPr>
+          <w:rFonts w:ascii="Times New Roman" w:hAnsi="Times New Roman" w:cs="Times New Roman"/>
+          <w:b/>
+          <w:sz w:val="15"/>
+          <w:szCs w:val="15"/>
+        </w:rPr>
+        <w:t>chairman.position</w:t>
+      </w:r>
+      <w:proofErr w:type="spellEnd"/>
+      <w:proofErr w:type="gramEnd"/>
+      <w:r>
+        <w:rPr>
+          <w:rFonts w:ascii="Times New Roman" w:hAnsi="Times New Roman" w:cs="Times New Roman"/>
+          <w:b/>
+          <w:sz w:val="15"/>
+          <w:szCs w:val="15"/>
+        </w:rPr>
+        <w:t>+++</w:t>
       </w:r>
     </w:p>
     <w:p>
       <w:pPr>
-        <w:spacing w:after="0"/>
-        <w:jc w:val="center"/>
+        <w:ind w:left="384"/>
         <w:rPr>
           <w:rFonts w:ascii="Times New Roman" w:hAnsi="Times New Roman" w:cs="Times New Roman"/>
-        </w:rPr>
-      </w:pPr>
-      <w:r>
-        <w:rPr>
-          <w:rFonts w:ascii="Times New Roman" w:hAnsi="Times New Roman" w:cs="Times New Roman"/>
-        </w:rPr>
-        <w:t>Committee on Education &amp; Senior Citizen</w:t>
-      </w:r>
-    </w:p>
-    <w:p>
-      <w:pPr>
-        <w:spacing w:after="0"/>
-        <w:jc w:val="center"/>
-        <w:rPr>
-          <w:rFonts w:ascii="Times New Roman" w:hAnsi="Times New Roman" w:cs="Times New Roman"/>
-        </w:rPr>
-      </w:pPr>
-    </w:p>
-    <w:p>
-      <w:pPr>
-        <w:spacing w:after="0"/>
-        <w:jc w:val="center"/>
-        <w:rPr>
-          <w:rFonts w:ascii="Times New Roman" w:hAnsi="Times New Roman" w:cs="Times New Roman"/>
+          <w:b/>
+          <w:sz w:val="15"/>
+          <w:szCs w:val="15"/>
         </w:rPr>
       </w:pPr>
       <w:r>
         <w:rPr>
           <w:rFonts w:ascii="Times New Roman" w:hAnsi="Times New Roman" w:cs="Times New Roman"/>
           <w:b/>
-          <w:bCs/>
+          <w:sz w:val="15"/>
+          <w:szCs w:val="15"/>
         </w:rPr>
-        <w:t>HON. ROSALINA L. OLAYAO</w:t>
+        <w:t xml:space="preserve">+++INS </w:t>
       </w:r>
+      <w:proofErr w:type="spellStart"/>
+      <w:proofErr w:type="gramStart"/>
       <w:r>
         <w:rPr>
           <w:rFonts w:ascii="Times New Roman" w:hAnsi="Times New Roman" w:cs="Times New Roman"/>
+          <w:b/>
+          <w:sz w:val="15"/>
+          <w:szCs w:val="15"/>
         </w:rPr>
-        <w:t xml:space="preserve"> - Committee on Budget and Appropriation</w:t>
+        <w:t>chairman.description</w:t>
+      </w:r>
+      <w:proofErr w:type="spellEnd"/>
+      <w:proofErr w:type="gramEnd"/>
+      <w:r>
+        <w:rPr>
+          <w:rFonts w:ascii="Times New Roman" w:hAnsi="Times New Roman" w:cs="Times New Roman"/>
+          <w:b/>
+          <w:sz w:val="15"/>
+          <w:szCs w:val="15"/>
+        </w:rPr>
+        <w:t>+++</w:t>
       </w:r>
     </w:p>
     <w:p>
       <w:pPr>
-        <w:spacing w:after="0"/>
-        <w:jc w:val="center"/>
+        <w:ind w:left="384"/>
         <w:rPr>
           <w:rFonts w:ascii="Times New Roman" w:hAnsi="Times New Roman" w:cs="Times New Roman"/>
-          <w:sz w:val="20"/>
-          <w:szCs w:val="20"/>
-        </w:rPr>
-      </w:pPr>
-      <w:r>
-        <w:rPr>
-          <w:rFonts w:ascii="Times New Roman" w:hAnsi="Times New Roman" w:cs="Times New Roman"/>
-          <w:sz w:val="20"/>
-          <w:szCs w:val="20"/>
-        </w:rPr>
-        <w:t>Committee on Family, Woman and Children</w:t>
-      </w:r>
-    </w:p>
-    <w:p>
-      <w:pPr>
-        <w:spacing w:after="0"/>
-        <w:jc w:val="center"/>
-        <w:rPr>
-          <w:rFonts w:ascii="Times New Roman" w:hAnsi="Times New Roman" w:cs="Times New Roman"/>
+          <w:b/>
+          <w:sz w:val="15"/>
+          <w:szCs w:val="15"/>
         </w:rPr>
       </w:pPr>
     </w:p>
     <w:p>
       <w:pPr>
-        <w:jc w:val="center"/>
+        <w:ind w:left="384"/>
         <w:rPr>
           <w:rFonts w:ascii="Times New Roman" w:hAnsi="Times New Roman" w:cs="Times New Roman"/>
+          <w:b/>
+          <w:sz w:val="15"/>
+          <w:szCs w:val="15"/>
         </w:rPr>
       </w:pPr>
       <w:r>
         <w:rPr>
           <w:rFonts w:ascii="Times New Roman" w:hAnsi="Times New Roman" w:cs="Times New Roman"/>
           <w:b/>
-          <w:bCs/>
+          <w:sz w:val="15"/>
+          <w:szCs w:val="15"/>
         </w:rPr>
-        <w:t>HON. BERNIE A. VILLACRUZ</w:t>
-      </w:r>
-      <w:r>
-        <w:rPr>
-          <w:rFonts w:ascii="Times New Roman" w:hAnsi="Times New Roman" w:cs="Times New Roman"/>
-        </w:rPr>
-        <w:t xml:space="preserve"> - Committee on Agriculture &amp; Social Services</w:t>
+        <w:t>COUNCILORS:</w:t>
       </w:r>
     </w:p>
     <w:p>
       <w:pPr>
-        <w:jc w:val="center"/>
+        <w:ind w:left="384"/>
         <w:rPr>
           <w:rFonts w:ascii="Times New Roman" w:hAnsi="Times New Roman" w:cs="Times New Roman"/>
+          <w:b/>
+          <w:sz w:val="15"/>
+          <w:szCs w:val="15"/>
         </w:rPr>
       </w:pPr>
       <w:r>
         <w:rPr>
           <w:rFonts w:ascii="Times New Roman" w:hAnsi="Times New Roman" w:cs="Times New Roman"/>
           <w:b/>
-          <w:bCs/>
+          <w:sz w:val="15"/>
+          <w:szCs w:val="15"/>
         </w:rPr>
-        <w:t>HON. ROSALINA O. CABILLO</w:t>
-      </w:r>
-      <w:r>
-        <w:rPr>
-          <w:rFonts w:ascii="Times New Roman" w:hAnsi="Times New Roman" w:cs="Times New Roman"/>
-        </w:rPr>
-        <w:t xml:space="preserve"> - Committee on Health &amp; Environment</w:t>
+        <w:t>+++FOR councilor IN councilors+++</w:t>
       </w:r>
     </w:p>
     <w:p>
       <w:pPr>
-        <w:jc w:val="center"/>
+        <w:ind w:left="384"/>
         <w:rPr>
           <w:rFonts w:ascii="Times New Roman" w:hAnsi="Times New Roman" w:cs="Times New Roman"/>
+          <w:b/>
+          <w:sz w:val="15"/>
+          <w:szCs w:val="15"/>
         </w:rPr>
       </w:pPr>
       <w:r>
         <w:rPr>
           <w:rFonts w:ascii="Times New Roman" w:hAnsi="Times New Roman" w:cs="Times New Roman"/>
           <w:b/>
-          <w:bCs/>
+          <w:sz w:val="15"/>
+          <w:szCs w:val="15"/>
         </w:rPr>
-        <w:t>HON. TEODORO M. SILVA</w:t>
-      </w:r>
-      <w:r>
-        <w:rPr>
-          <w:rFonts w:ascii="Times New Roman" w:hAnsi="Times New Roman" w:cs="Times New Roman"/>
-        </w:rPr>
-        <w:t xml:space="preserve"> - Committee on Peace and Order</w:t>
+        <w:t>HON. +++INS $councilor.name+++</w:t>
       </w:r>
     </w:p>
     <w:p>
       <w:pPr>
-        <w:spacing w:after="0"/>
-        <w:jc w:val="center"/>
+        <w:ind w:left="384"/>
         <w:rPr>
           <w:rFonts w:ascii="Times New Roman" w:hAnsi="Times New Roman" w:cs="Times New Roman"/>
           <w:b/>
-          <w:bCs/>
+          <w:sz w:val="15"/>
+          <w:szCs w:val="15"/>
         </w:rPr>
       </w:pPr>
       <w:r>
         <w:rPr>
           <w:rFonts w:ascii="Times New Roman" w:hAnsi="Times New Roman" w:cs="Times New Roman"/>
           <w:b/>
-          <w:bCs/>
+          <w:sz w:val="15"/>
+          <w:szCs w:val="15"/>
         </w:rPr>
-        <w:t>HON. JHON MICHAEL O. COLOT</w:t>
+        <w:t>+++INS $</w:t>
+      </w:r>
+      <w:proofErr w:type="spellStart"/>
+      <w:proofErr w:type="gramStart"/>
+      <w:r>
+        <w:rPr>
+          <w:rFonts w:ascii="Times New Roman" w:hAnsi="Times New Roman" w:cs="Times New Roman"/>
+          <w:b/>
+          <w:sz w:val="15"/>
+          <w:szCs w:val="15"/>
+        </w:rPr>
+        <w:t>councilor.description</w:t>
+      </w:r>
+      <w:proofErr w:type="spellEnd"/>
+      <w:proofErr w:type="gramEnd"/>
+      <w:r>
+        <w:rPr>
+          <w:rFonts w:ascii="Times New Roman" w:hAnsi="Times New Roman" w:cs="Times New Roman"/>
+          <w:b/>
+          <w:sz w:val="15"/>
+          <w:szCs w:val="15"/>
+        </w:rPr>
+        <w:t xml:space="preserve"> || ''+++</w:t>
       </w:r>
     </w:p>
     <w:p>
       <w:pPr>
-        <w:spacing w:after="0"/>
-        <w:jc w:val="center"/>
+        <w:ind w:left="384"/>
         <w:rPr>
           <w:rFonts w:ascii="Times New Roman" w:hAnsi="Times New Roman" w:cs="Times New Roman"/>
-        </w:rPr>
-      </w:pPr>
-      <w:r>
-        <w:rPr>
-          <w:rFonts w:ascii="Times New Roman" w:hAnsi="Times New Roman" w:cs="Times New Roman"/>
-        </w:rPr>
-        <w:t>Committee on Public Works</w:t>
-      </w:r>
-    </w:p>
-    <w:p>
-      <w:pPr>
-        <w:spacing w:after="0"/>
-        <w:jc w:val="center"/>
-        <w:rPr>
-          <w:rFonts w:ascii="Times New Roman" w:hAnsi="Times New Roman" w:cs="Times New Roman"/>
-        </w:rPr>
-      </w:pPr>
-    </w:p>
-    <w:p>
-      <w:pPr>
-        <w:jc w:val="center"/>
-        <w:rPr>
-          <w:rFonts w:ascii="Times New Roman" w:hAnsi="Times New Roman" w:cs="Times New Roman"/>
+          <w:b/>
+          <w:sz w:val="15"/>
+          <w:szCs w:val="15"/>
         </w:rPr>
       </w:pPr>
       <w:r>
         <w:rPr>
           <w:rFonts w:ascii="Times New Roman" w:hAnsi="Times New Roman" w:cs="Times New Roman"/>
           <w:b/>
-          <w:bCs/>
+          <w:sz w:val="15"/>
+          <w:szCs w:val="15"/>
         </w:rPr>
-        <w:t>HON. PEPING A. CABILLO</w:t>
-      </w:r>
-      <w:r>
-        <w:rPr>
-          <w:rFonts w:ascii="Times New Roman" w:hAnsi="Times New Roman" w:cs="Times New Roman"/>
-        </w:rPr>
-        <w:t xml:space="preserve"> - Committee on Transportation and Communications</w:t>
+        <w:t>+++END-FOR councilor+++</w:t>
       </w:r>
     </w:p>
     <w:p>
       <w:pPr>
-        <w:spacing w:after="0"/>
-        <w:jc w:val="center"/>
-        <w:rPr>
-          <w:rFonts w:ascii="Times New Roman" w:hAnsi="Times New Roman" w:cs="Times New Roman"/>
-        </w:rPr>
-      </w:pPr>
-      <w:r>
+        <w:ind w:left="384"/>
         <w:rPr>
           <w:rFonts w:ascii="Times New Roman" w:hAnsi="Times New Roman" w:cs="Times New Roman"/>
           <w:b/>
-          <w:bCs/>
+          <w:sz w:val="10"/>
+          <w:szCs w:val="10"/>
         </w:rPr>
-        <w:t>HON. RENATO B. MOREN</w:t>
-      </w:r>
-      <w:r>
-        <w:rPr>
-          <w:rFonts w:ascii="Times New Roman" w:hAnsi="Times New Roman" w:cs="Times New Roman"/>
-        </w:rPr>
-        <w:t xml:space="preserve"> - Committee on Cooperative</w:t>
-      </w:r>
+      </w:pPr>
     </w:p>
     <w:p>
       <w:pPr>
-        <w:spacing w:after="0"/>
-        <w:jc w:val="center"/>
+        <w:ind w:left="384"/>
         <w:rPr>
           <w:rFonts w:ascii="Times New Roman" w:hAnsi="Times New Roman" w:cs="Times New Roman"/>
-        </w:rPr>
-      </w:pPr>
-      <w:r>
-        <w:rPr>
-          <w:rFonts w:ascii="Times New Roman" w:hAnsi="Times New Roman" w:cs="Times New Roman"/>
-        </w:rPr>
-        <w:t>S.K. Chairman - Committee on Youth &amp; Sports Development</w:t>
-      </w:r>
-    </w:p>
-    <w:p>
-      <w:pPr>
-        <w:spacing w:after="0"/>
-        <w:jc w:val="center"/>
-        <w:rPr>
-          <w:rFonts w:ascii="Times New Roman" w:hAnsi="Times New Roman" w:cs="Times New Roman"/>
+          <w:b/>
+          <w:sz w:val="10"/>
+          <w:szCs w:val="10"/>
         </w:rPr>
       </w:pPr>
     </w:p>
@@ -1176,19 +1124,6 @@
         </w:rPr>
         <w:t>eadership</w:t>
       </w:r>
-    </w:p>
-    <w:p>
-      <w:pPr>
-        <w:widowControl w:val="0"/>
-        <w:autoSpaceDE w:val="0"/>
-        <w:autoSpaceDN w:val="0"/>
-        <w:spacing w:before="430" w:after="0" w:line="240" w:lineRule="auto"/>
-        <w:rPr>
-          <w:rFonts w:ascii="Times New Roman" w:eastAsia="Arial MT" w:hAnsi="Times New Roman" w:cs="Times New Roman"/>
-          <w:sz w:val="47"/>
-          <w:szCs w:val="47"/>
-        </w:rPr>
-      </w:pPr>
       <w:r>
         <w:rPr>
           <w:rFonts w:ascii="Times New Roman" w:hAnsi="Times New Roman" w:cs="Times New Roman"/>
@@ -1238,6 +1173,19 @@
           </wp:anchor>
         </w:drawing>
       </w:r>
+    </w:p>
+    <w:p>
+      <w:pPr>
+        <w:widowControl w:val="0"/>
+        <w:autoSpaceDE w:val="0"/>
+        <w:autoSpaceDN w:val="0"/>
+        <w:spacing w:before="430" w:after="0" w:line="240" w:lineRule="auto"/>
+        <w:rPr>
+          <w:rFonts w:ascii="Times New Roman" w:eastAsia="Arial MT" w:hAnsi="Times New Roman" w:cs="Times New Roman"/>
+          <w:sz w:val="47"/>
+          <w:szCs w:val="47"/>
+        </w:rPr>
+      </w:pPr>
     </w:p>
     <w:p>
       <w:pPr>
@@ -1447,13 +1395,7 @@
         <w:rPr>
           <w:rFonts w:ascii="Book Antiqua" w:eastAsia="Book Antiqua" w:hAnsi="Book Antiqua" w:cs="Book Antiqua"/>
         </w:rPr>
-        <w:t>+++INS age+++</w:t>
-      </w:r>
-      <w:r>
-        <w:rPr>
-          <w:rFonts w:ascii="Book Antiqua" w:eastAsia="Book Antiqua" w:hAnsi="Book Antiqua" w:cs="Book Antiqua"/>
-        </w:rPr>
-        <w:t xml:space="preserve"> </w:t>
+        <w:t xml:space="preserve">+++INS age+++ </w:t>
       </w:r>
       <w:r>
         <w:rPr>
@@ -1519,10 +1461,11 @@
       </w:r>
       <w:proofErr w:type="spellEnd"/>
       <w:r>
-        <w:t>+++</w:t>
+        <w:t>++</w:t>
       </w:r>
+      <w:proofErr w:type="gramStart"/>
       <w:r>
-        <w:t xml:space="preserve"> </w:t>
+        <w:t xml:space="preserve">+ </w:t>
       </w:r>
       <w:r>
         <w:rPr>
@@ -1530,7 +1473,16 @@
           <w:sz w:val="21"/>
           <w:szCs w:val="21"/>
         </w:rPr>
-        <w:t>, at Barangay Sto Ni</w:t>
+        <w:t>,</w:t>
+      </w:r>
+      <w:proofErr w:type="gramEnd"/>
+      <w:r>
+        <w:rPr>
+          <w:rFonts w:ascii="Times New Roman" w:eastAsia="Verdana" w:hAnsi="Times New Roman" w:cs="Times New Roman"/>
+          <w:sz w:val="21"/>
+          <w:szCs w:val="21"/>
+        </w:rPr>
+        <w:t xml:space="preserve"> at Barangay Sto Ni</w:t>
       </w:r>
       <w:r>
         <w:rPr>
@@ -1548,115 +1500,6 @@
         </w:rPr>
         <w:t>o, Lipa City, for whatever purpose this may legally serve.</w:t>
       </w:r>
-    </w:p>
-    <w:p>
-      <w:pPr>
-        <w:widowControl w:val="0"/>
-        <w:autoSpaceDE w:val="0"/>
-        <w:autoSpaceDN w:val="0"/>
-        <w:spacing w:after="0" w:line="480" w:lineRule="auto"/>
-        <w:rPr>
-          <w:rFonts w:ascii="Times New Roman" w:eastAsia="Verdana" w:hAnsi="Times New Roman" w:cs="Times New Roman"/>
-          <w:sz w:val="21"/>
-          <w:szCs w:val="21"/>
-        </w:rPr>
-      </w:pPr>
-    </w:p>
-    <w:p>
-      <w:pPr>
-        <w:widowControl w:val="0"/>
-        <w:autoSpaceDE w:val="0"/>
-        <w:autoSpaceDN w:val="0"/>
-        <w:spacing w:after="0" w:line="480" w:lineRule="auto"/>
-        <w:rPr>
-          <w:rFonts w:ascii="Times New Roman" w:eastAsia="Verdana" w:hAnsi="Times New Roman" w:cs="Times New Roman"/>
-          <w:sz w:val="21"/>
-          <w:szCs w:val="21"/>
-        </w:rPr>
-      </w:pPr>
-    </w:p>
-    <w:p>
-      <w:pPr>
-        <w:widowControl w:val="0"/>
-        <w:autoSpaceDE w:val="0"/>
-        <w:autoSpaceDN w:val="0"/>
-        <w:spacing w:after="0" w:line="480" w:lineRule="auto"/>
-        <w:rPr>
-          <w:rFonts w:ascii="Times New Roman" w:eastAsia="Verdana" w:hAnsi="Times New Roman" w:cs="Times New Roman"/>
-          <w:b/>
-          <w:bCs/>
-          <w:sz w:val="21"/>
-          <w:szCs w:val="21"/>
-        </w:rPr>
-      </w:pPr>
-      <w:r>
-        <w:rPr>
-          <w:rFonts w:ascii="Times New Roman" w:eastAsia="Verdana" w:hAnsi="Times New Roman" w:cs="Times New Roman"/>
-          <w:b/>
-          <w:bCs/>
-          <w:sz w:val="21"/>
-          <w:szCs w:val="21"/>
-        </w:rPr>
-        <w:t xml:space="preserve">                                                                      HON. JERRY P. LEYESA</w:t>
-      </w:r>
-    </w:p>
-    <w:p>
-      <w:pPr>
-        <w:widowControl w:val="0"/>
-        <w:autoSpaceDE w:val="0"/>
-        <w:autoSpaceDN w:val="0"/>
-        <w:spacing w:after="0" w:line="480" w:lineRule="auto"/>
-        <w:rPr>
-          <w:rFonts w:ascii="Times New Roman" w:eastAsia="Verdana" w:hAnsi="Times New Roman" w:cs="Times New Roman"/>
-          <w:i/>
-          <w:iCs/>
-          <w:sz w:val="21"/>
-          <w:szCs w:val="21"/>
-        </w:rPr>
-      </w:pPr>
-      <w:r>
-        <w:rPr>
-          <w:rFonts w:ascii="Times New Roman" w:eastAsia="Verdana" w:hAnsi="Times New Roman" w:cs="Times New Roman"/>
-          <w:sz w:val="21"/>
-          <w:szCs w:val="21"/>
-        </w:rPr>
-        <w:t xml:space="preserve">                                                             </w:t>
-      </w:r>
-      <w:r>
-        <w:rPr>
-          <w:rFonts w:ascii="Times New Roman" w:eastAsia="Verdana" w:hAnsi="Times New Roman" w:cs="Times New Roman"/>
-          <w:i/>
-          <w:iCs/>
-          <w:sz w:val="21"/>
-          <w:szCs w:val="21"/>
-        </w:rPr>
-        <w:t xml:space="preserve">        </w:t>
-      </w:r>
-      <w:r>
-        <w:rPr>
-          <w:rFonts w:ascii="Times New Roman" w:eastAsia="Verdana" w:hAnsi="Times New Roman" w:cs="Times New Roman"/>
-          <w:i/>
-          <w:iCs/>
-          <w:sz w:val="21"/>
-          <w:szCs w:val="21"/>
-        </w:rPr>
-        <w:t xml:space="preserve">  </w:t>
-      </w:r>
-      <w:r>
-        <w:rPr>
-          <w:rFonts w:ascii="Times New Roman" w:eastAsia="Verdana" w:hAnsi="Times New Roman" w:cs="Times New Roman"/>
-          <w:i/>
-          <w:iCs/>
-          <w:sz w:val="21"/>
-          <w:szCs w:val="21"/>
-        </w:rPr>
-        <w:t>BARANGAY CHAIRMAN</w:t>
-      </w:r>
-    </w:p>
-    <w:p>
-      <w:pPr>
-        <w:spacing w:line="480" w:lineRule="auto"/>
-      </w:pPr>
       <w:r>
         <w:t xml:space="preserve">  </w:t>
       </w:r>

</xml_diff>